<commit_message>
Update site for graduation
Update self-description from "final-year Software Engineering student" to
"Software Engineering graduate (BSc, First-Class Distinction)" across hero,
About, README, SEO/meta descriptions, and both locales. Reconcile the degree
label to one form (BSc Software Engineering) and past-tense the graduation
milestone in the journey timeline. Add alumniOf to JSON-LD.

Co-Authored-By: Claude Opus 4.8 <noreply@anthropic.com>
</commit_message>
<xml_diff>
--- a/public/resume/Rashid_Al_Ghafri_CV_ATS.docx
+++ b/public/resume/Rashid_Al_Ghafri_CV_ATS.docx
@@ -131,7 +131,7 @@
           <w:sz w:val="20"/>
           <w:szCs w:val="20"/>
         </w:rPr>
-        <w:t xml:space="preserve">Final-year Software Engineering student (CGPA 3.96/4.00) with hands-on experience designing, building, and deploying full-stack systems from concept to launch. Skilled in AI integration, real-time web applications, and leading technical projects under pressure. A national STEM finalist and chosen department representative, pairing academic excellence with entrepreneurial drive and clear technical communication.</w:t>
+        <w:t xml:space="preserve">Software Engineering graduate (BSc, CGPA 3.96/4.00 — First-Class Distinction) with hands-on experience designing, building, and deploying full-stack systems from concept to launch. Skilled in AI integration, real-time web applications, and leading technical projects under pressure. A national STEM finalist and chosen department representative, pairing academic excellence with entrepreneurial drive and clear technical communication.</w:t>
       </w:r>
     </w:p>
     <w:p>
@@ -764,7 +764,7 @@
           <w:sz w:val="19"/>
           <w:szCs w:val="19"/>
         </w:rPr>
-        <w:t xml:space="preserve">	2025 – 2026</w:t>
+        <w:t xml:space="preserve">	2025 – Present</w:t>
       </w:r>
     </w:p>
     <w:p>

</xml_diff>